<commit_message>
Eduardo Costa: revisão da Parte 3
Co-Authored-By: Claude Opus 5.5 <noreply@anthropic.com>
Claude-Session: https://claude.ai/code/session_01MJjUEEZrxQDEUifKK2vj9g
</commit_message>
<xml_diff>
--- a/roteiros/eduardo-costa/EduardoCosta_Parte3.docx
+++ b/roteiros/eduardo-costa/EduardoCosta_Parte3.docx
@@ -359,7 +359,7 @@
         <w:rPr>
           <w:color w:val="000000"/>
         </w:rPr>
-        <w:t>No começo de dois mil e dezenove, um deles ganhou força.</w:t>
+        <w:t>Em dois mil e dezenove, um deles ganhou força.</w:t>
       </w:r>
     </w:p>
     <w:p>
@@ -511,7 +511,7 @@
         <w:rPr>
           <w:color w:val="000000"/>
         </w:rPr>
-        <w:t>O menino que saiu de casa ainda criança para sustentar a família tinha, de certa forma, virado pai do próprio irmão.</w:t>
+        <w:t>O menino que saiu de casa ainda criança para ajudar a família tinha, de certa forma, virado pai do próprio irmão.</w:t>
       </w:r>
     </w:p>
     <w:p>
@@ -583,7 +583,7 @@
         <w:rPr>
           <w:color w:val="1F4EB4"/>
         </w:rPr>
-        <w:t>Dois dias depois, a Polícia Civil de Minas Gerais apareceu na casa de Eduardo Costa, em Belo Horizonte.</w:t>
+        <w:t>Poucos dias depois, a Polícia Civil de Minas Gerais apareceu na casa de Eduardo Costa, em Belo Horizonte.</w:t>
       </w:r>
     </w:p>
     <w:p>
@@ -607,7 +607,7 @@
         <w:rPr>
           <w:color w:val="000000"/>
         </w:rPr>
-        <w:t>O menino que tinha dormido em rodoviária para virar cantor agora recebia policiais na porta da mansão.</w:t>
+        <w:t>O menino que tinha dormido em rodoviária para virar cantor agora recebia policiais na porta de casa.</w:t>
       </w:r>
     </w:p>
     <w:p>
@@ -623,7 +623,7 @@
         <w:rPr>
           <w:color w:val="1F4EB4"/>
         </w:rPr>
-        <w:t>Mas a mulher que levou Eduardo Costa até um pedido de prisão foi outra. Uma mulher que ele nunca namorou, nunca conheceu de perto, e que estava a centenas de quilômetros dali. E tudo começou meses antes daqueles áudios, numa noite em que ele pegou o celular depois de assistir a um programa de televisão.</w:t>
+        <w:t>Mas a mulher que levou Eduardo Costa até um pedido de prisão foi outra. Uma mulher que ele nunca namorou e que estava a centenas de quilômetros dali. E tudo começou mais de um ano antes daqueles áudios, no dia em que ele pegou o celular depois de assistir a um programa de televisão.</w:t>
       </w:r>
     </w:p>
     <w:sectPr>

</xml_diff>